<commit_message>
Propaga troca do e-mail de contato pra todas as fontes canônicas
O e-mail de contato havia sido trocado de caiofabianodbz2@gmail.com para
alienraccoonentertainment@gmail.com diretamente nos .docx da pasta
"a revisar" (em outra sessão), sem refletir em Políticas/*.md, docs/ ou nos
snapshots de versão. Propagado em todos os 5 documentos, docs/index.md,
histórico de versões, e regenerados os .docx correspondentes.
</commit_message>
<xml_diff>
--- a/Políticas/EULA_Campfire_Tradutor_v0.3.docx
+++ b/Políticas/EULA_Campfire_Tradutor_v0.3.docx
@@ -49,7 +49,7 @@
           <w:sz w:val="20"/>
           <w:szCs w:val="20"/>
         </w:rPr>
-        <w:t xml:space="preserve">REVISÃO JURÍDICA (Advogada) incorporada em 31/07/2026. Resta confirmar: modelo de licença (Seção 2).</w:t>
+        <w:t xml:space="preserve">REVISÃO JURÍDICA (Advogada) incorporada em 31/07/2026.</w:t>
       </w:r>
     </w:p>
     <w:p>
@@ -806,7 +806,7 @@
           <w:sz w:val="22"/>
           <w:szCs w:val="22"/>
         </w:rPr>
-        <w:t xml:space="preserve">caiofabianodbz2@gmail.com</w:t>
+        <w:t xml:space="preserve">alienraccoonentertainment@gmail.com</w:t>
       </w:r>
     </w:p>
     <w:sectPr>

</xml_diff>